<commit_message>
Link submission materials in README, correct AI disclosure, add placeholder filler
- README lists the presentation, demo video, AI disclosure and the release with the results file
- AI disclosure now says the benchmark was launched through Claude Code at the team's direction
- submission/fill_placeholders.py fills team details in the deck, disclosure and README
</commit_message>
<xml_diff>
--- a/submission/VITV_TeamName_AI_Disclosure.docx
+++ b/submission/VITV_TeamName_AI_Disclosure.docx
@@ -350,7 +350,7 @@
           </w:tcPr>
           <w:p>
             <w:r>
-              <w:t>No</w:t>
+              <w:t>Yes</w:t>
             </w:r>
           </w:p>
         </w:tc>
@@ -360,7 +360,7 @@
           </w:tcPr>
           <w:p>
             <w:r>
-              <w:t>No analysis was done by the AI. Benchmark numbers come from running the code on the team's own machine.</w:t>
+              <w:t>The AI launched the benchmark on the team's own laptop at the team's direction and copied the scores from run_summary.json. It did not change or estimate any score.</w:t>
             </w:r>
           </w:p>
         </w:tc>
@@ -424,7 +424,7 @@
           </w:tcPr>
           <w:p>
             <w:r>
-              <w:t>The team picked the theme and ran the benchmark themselves.</w:t>
+              <w:t>The team picked the theme, chose the model and approved each benchmark run.</w:t>
             </w:r>
           </w:p>
         </w:tc>
@@ -511,7 +511,7 @@
           </w:tcPr>
           <w:p>
             <w:r>
-              <w:t>Splits a question into a full view and a statement-only view without input/output sections; maps words like maximum to max. Tool: Claude (Anthropic), used through the Claude desktop app (Cowork).</w:t>
+              <w:t>Splits a question into a full view and a statement-only view without input/output sections; maps words like maximum to max. Tool: Claude (Anthropic), used through the Claude desktop app (Cowork and Claude Code).</w:t>
             </w:r>
           </w:p>
         </w:tc>
@@ -655,7 +655,7 @@
           </w:tcPr>
           <w:p>
             <w:r>
-              <w:t>Hand written keyword lexicon of 13 topics used for a small score bonus. Tool: Claude (Anthropic), used through the Claude desktop app (Cowork).</w:t>
+              <w:t>Hand written keyword lexicon of 13 topics used for a small score bonus. Tool: Claude (Anthropic), used through the Claude desktop app (Cowork and Claude Code).</w:t>
             </w:r>
           </w:p>
         </w:tc>
@@ -799,7 +799,7 @@
           </w:tcPr>
           <w:p>
             <w:r>
-              <w:t>BM25 on scipy sparse matrices; identifiers split into parts, plus comments and strings. Tool: Claude (Anthropic), used through the Claude desktop app (Cowork).</w:t>
+              <w:t>BM25 on scipy sparse matrices; identifiers split into parts, plus comments and strings. Tool: Claude (Anthropic), used through the Claude desktop app (Cowork and Claude Code).</w:t>
             </w:r>
           </w:p>
         </w:tc>
@@ -943,7 +943,7 @@
           </w:tcPr>
           <w:p>
             <w:r>
-              <w:t>Wraps a third party pretrained embedding model (BAAI/bge-small-en-v1.5, not written or trained by us) and fuses scores per query. Tool: Claude (Anthropic), used through the Claude desktop app (Cowork).</w:t>
+              <w:t>Wraps a third party pretrained embedding model (BAAI/bge-small-en-v1.5, not written or trained by us) and fuses scores per query. Tool: Claude (Anthropic), used through the Claude desktop app (Cowork and Claude Code).</w:t>
             </w:r>
           </w:p>
         </w:tc>
@@ -1087,7 +1087,7 @@
           </w:tcPr>
           <w:p>
             <w:r>
-              <w:t>PrePostPipelineEncoder for MTEB and scripts/run_eval.py that writes appsretrieval_results.json. Tool: Claude (Anthropic), used through the Claude desktop app (Cowork).</w:t>
+              <w:t>PrePostPipelineEncoder for MTEB and scripts/run_eval.py that writes appsretrieval_results.json. Tool: Claude (Anthropic), used through the Claude desktop app (Cowork and Claude Code).</w:t>
             </w:r>
           </w:p>
         </w:tc>
@@ -1153,7 +1153,7 @@
           </w:tcPr>
           <w:p>
             <w:r>
-              <w:t>Team ran the script on their own machine.</w:t>
+              <w:t>Run on the team's own laptop through Claude Code, at the team's direction.</w:t>
             </w:r>
           </w:p>
         </w:tc>
@@ -1231,7 +1231,7 @@
           </w:tcPr>
           <w:p>
             <w:r>
-              <w:t>Hash based sqlite cache so only changed snippets are re-embedded; search one version or all versions. Tool: Claude (Anthropic), used through the Claude desktop app (Cowork).</w:t>
+              <w:t>Hash based sqlite cache so only changed snippets are re-embedded; search one version or all versions. Tool: Claude (Anthropic), used through the Claude desktop app (Cowork and Claude Code).</w:t>
             </w:r>
           </w:p>
         </w:tc>
@@ -1375,7 +1375,7 @@
           </w:tcPr>
           <w:p>
             <w:r>
-              <w:t>Python (ast) and JavaScript (brace matching) function level chunking. Tool: Claude (Anthropic), used through the Claude desktop app (Cowork).</w:t>
+              <w:t>Python (ast) and JavaScript (brace matching) function level chunking. Tool: Claude (Anthropic), used through the Claude desktop app (Cowork and Claude Code).</w:t>
             </w:r>
           </w:p>
         </w:tc>
@@ -1519,7 +1519,7 @@
           </w:tcPr>
           <w:p>
             <w:r>
-              <w:t>Three versions of a small JavaScript voice assistant and a demo CLI. Tool: Claude (Anthropic), used through the Claude desktop app (Cowork).</w:t>
+              <w:t>Three versions of a small JavaScript voice assistant and a demo CLI. Tool: Claude (Anthropic), used through the Claude desktop app (Cowork and Claude Code).</w:t>
             </w:r>
           </w:p>
         </w:tc>
@@ -1663,7 +1663,7 @@
           </w:tcPr>
           <w:p>
             <w:r>
-              <w:t>19 offline tests, Dockerfile, pinned requirements, README. Tool: Claude (Anthropic), used through the Claude desktop app (Cowork).</w:t>
+              <w:t>19 offline tests, Dockerfile, pinned requirements, README. Tool: Claude (Anthropic), used through the Claude desktop app (Cowork and Claude Code).</w:t>
             </w:r>
           </w:p>
         </w:tc>
@@ -1807,7 +1807,7 @@
           </w:tcPr>
           <w:p>
             <w:r>
-              <w:t>Slides filled into the organizers' template. Tool: Claude (Anthropic), used through the Claude desktop app (Cowork).</w:t>
+              <w:t>Slides filled into the organizers' template. Tool: Claude (Anthropic), used through the Claude desktop app (Cowork and Claude Code).</w:t>
             </w:r>
           </w:p>
         </w:tc>

</xml_diff>